<commit_message>
Rewrite FDR executive summary for fingerprinting system
Updated to reflect the actual new_path architecture: RSSI fingerprinting
with kNN matching, leave-one-out R estimation, 4D Kalman smoothing, and
path-constrained routing. Uses measured results (4.67 m RMSE, 91-cell /
13-beacon survey) and honestly notes the sub-3 m target shortfall and
the trilateration-to-fingerprinting pivot.

https://claude.ai/code/session_01YPaUcNEuSehHxLsCEvydSP
</commit_message>
<xml_diff>
--- a/FDR_Executive_Summary.docx
+++ b/FDR_Executive_Summary.docx
@@ -10,6 +10,7 @@
       <w:r>
         <w:rPr>
           <w:b/>
+          <w:i w:val="0"/>
           <w:sz w:val="32"/>
         </w:rPr>
         <w:t>Executive Summary</w:t>
@@ -23,9 +24,10 @@
       <w:r>
         <w:rPr>
           <w:b/>
+          <w:i w:val="0"/>
           <w:sz w:val="24"/>
         </w:rPr>
-        <w:t>BLE Indoor Localization System</w:t>
+        <w:t>BLE Indoor Localization &amp; Navigation System</w:t>
       </w:r>
     </w:p>
     <w:p>
@@ -35,6 +37,7 @@
       </w:pPr>
       <w:r>
         <w:rPr>
+          <w:b w:val="0"/>
           <w:i/>
           <w:sz w:val="20"/>
         </w:rPr>
@@ -43,65 +46,68 @@
     </w:p>
     <w:p>
       <w:pPr>
-        <w:spacing w:after="120"/>
+        <w:spacing w:after="100"/>
         <w:jc w:val="center"/>
       </w:pPr>
       <w:r>
         <w:rPr>
-          <w:sz w:val="19"/>
+          <w:sz w:val="18"/>
         </w:rPr>
         <w:t>Authors: [Team Member Names]*</w:t>
       </w:r>
     </w:p>
     <w:p>
       <w:pPr>
-        <w:spacing w:before="160" w:after="60"/>
+        <w:spacing w:before="140" w:after="40"/>
       </w:pPr>
       <w:r>
         <w:rPr>
           <w:b/>
           <w:color w:val="1F3B73"/>
-          <w:sz w:val="23"/>
+          <w:sz w:val="22"/>
         </w:rPr>
         <w:t>1. Requirements</w:t>
       </w:r>
     </w:p>
     <w:p>
       <w:pPr>
+        <w:spacing w:after="80"/>
         <w:jc w:val="both"/>
       </w:pPr>
       <w:r>
         <w:rPr>
           <w:b w:val="0"/>
         </w:rPr>
-        <w:t>Indoor navigation remains an unsolved problem in environments where GPS is unavailable — hospitals, large university buildings, shopping malls, and warehouses. The root cause is the absence of a low-cost, infrastructure-light positioning layer indoors. Our target stakeholders are building occupants who need wayfinding assistance (e.g., students in Boelter Hall) and facility managers who seek occupancy and flow data without deploying proprietary hardware. A secondary stakeholder group is first responders who require reliable indoor localization in emergency scenarios.</w:t>
+        <w:t>Indoor wayfinding is unsolved in large multi-floor buildings where GPS does not penetrate. Our motivating context is UCLA's Boelter Hall, where students, visitors, and staff regularly fail to locate rooms across its 6th and 8th floors. The root cause is the absence of an affordable positioning layer that works indoors without dedicated infrastructure. Our primary stakeholders are building occupants needing turn-by-turn guidance; secondary stakeholders are facility managers who want coverage analytics, and first responders who need localization in GPS-denied spaces.</w:t>
       </w:r>
     </w:p>
     <w:p>
       <w:pPr>
+        <w:spacing w:after="80"/>
         <w:jc w:val="both"/>
       </w:pPr>
       <w:r>
         <w:rPr>
           <w:b w:val="0"/>
         </w:rPr>
-        <w:t xml:space="preserve">Our final design targets sub-3-meter position accuracy using commodity Bluetooth Low Energy (BLE) beacons, achieving real-time position updates at ~1 Hz with latency under 500 ms. </w:t>
+        <w:t xml:space="preserve">Our final design delivers real-time position tracking and on-path navigation using commodity Bluetooth Low Energy (BLE) beacons and a standard smartphone. The refined specification targets room-level guidance — keeping the user reliably on the correct corridor and floor — at a hardware cost under $50 per beacon (13 beacons cover the surveyed floor). </w:t>
       </w:r>
       <w:r>
         <w:rPr>
           <w:b/>
         </w:rPr>
-        <w:t xml:space="preserve">Quantified value: </w:t>
+        <w:t xml:space="preserve">Quantified outcome: </w:t>
       </w:r>
       <w:r>
         <w:rPr>
           <w:b w:val="0"/>
         </w:rPr>
-        <w:t>we estimate a correctly deployed system reduces average navigation time in a multi-floor building by 40–60% relative to no assistance, at a hardware cost under $50 per beacon (3–4 beacons per zone).</w:t>
+        <w:t>on a 91-cell survey our system achieves a measured 4.67 m position RMSE (leave-one-out cross-validation), which, combined with walkable-path constraint and routing, is sufficient for corridor-level wayfinding though short of true room-level (sub-3 m) accuracy.</w:t>
       </w:r>
     </w:p>
     <w:p>
       <w:pPr>
+        <w:spacing w:after="80"/>
         <w:jc w:val="both"/>
       </w:pPr>
       <w:r>
@@ -114,67 +120,92 @@
         <w:rPr>
           <w:b w:val="0"/>
         </w:rPr>
-        <w:t>Continuous BLE scanning increases smartphone battery drain by an estimated 5–10%, affecting device longevity for users who run the app in the background. Persistent BLE advertisement by deployed beacons introduces low-level RF congestion in the 2.4 GHz band, which may marginally degrade Wi-Fi throughput for non-users in the same space. Additionally, a permanently deployed indoor positioning infrastructure creates a passive location-tracking surface that, if the backend were compromised, could expose movement patterns of building occupants — raising privacy concerns for non-consenting individuals who simply occupy the same space.</w:t>
+        <w:t>Continuous BLE scanning raises smartphone battery drain an estimated 5–10%, shortening device runtime for users. Persistent beacon advertisement adds low-level congestion to the shared 2.4 GHz band, which can marginally reduce Wi-Fi throughput for nearby non-users. Finally, a permanently installed survey-based positioning system constitutes a passive location-tracking surface: if the fingerprint backend were compromised, the movement of building occupants who never opted in could be inferred, a privacy concern for non-consenting bystanders.</w:t>
       </w:r>
     </w:p>
     <w:p>
       <w:pPr>
-        <w:spacing w:before="160" w:after="60"/>
+        <w:spacing w:before="140" w:after="40"/>
       </w:pPr>
       <w:r>
         <w:rPr>
           <w:b/>
           <w:color w:val="1F3B73"/>
-          <w:sz w:val="23"/>
+          <w:sz w:val="22"/>
         </w:rPr>
         <w:t>2. System Design</w:t>
       </w:r>
     </w:p>
     <w:p>
       <w:pPr>
+        <w:spacing w:after="80"/>
         <w:jc w:val="both"/>
       </w:pPr>
       <w:r>
         <w:rPr>
           <w:b w:val="0"/>
         </w:rPr>
-        <w:t xml:space="preserve">The final system comprises three tightly coupled subsystems: a </w:t>
+        <w:t xml:space="preserve">Over the design process we pivoted from pure RSSI trilateration to a </w:t>
       </w:r>
       <w:r>
         <w:rPr>
           <w:b/>
         </w:rPr>
-        <w:t>BLE scanning client</w:t>
+        <w:t>fingerprinting</w:t>
       </w:r>
       <w:r>
         <w:rPr>
           <w:b w:val="0"/>
         </w:rPr>
-        <w:t xml:space="preserve"> (React Native mobile app), a </w:t>
+        <w:t xml:space="preserve"> architecture with path-constrained routing, because trilateration's path-loss distance estimates proved too noisy indoors due to multipath. The final system has four subsystems: a React Native </w:t>
       </w:r>
       <w:r>
         <w:rPr>
           <w:b/>
         </w:rPr>
-        <w:t>signal processing backend</w:t>
+        <w:t>survey &amp; navigation client</w:t>
       </w:r>
       <w:r>
         <w:rPr>
           <w:b w:val="0"/>
         </w:rPr>
-        <w:t xml:space="preserve"> (Python/Flask server), and a </w:t>
+        <w:t xml:space="preserve">, a Flask </w:t>
       </w:r>
       <w:r>
         <w:rPr>
           <w:b/>
         </w:rPr>
-        <w:t>calibration subsystem</w:t>
+        <w:t>fingerprint/matching backend</w:t>
       </w:r>
       <w:r>
         <w:rPr>
           <w:b w:val="0"/>
         </w:rPr>
-        <w:t xml:space="preserve"> that bridges hardware variability to algorithm parameters.</w:t>
+        <w:t xml:space="preserve">, a </w:t>
+      </w:r>
+      <w:r>
+        <w:rPr>
+          <w:b/>
+        </w:rPr>
+        <w:t>Kalman smoothing + path-constraint</w:t>
+      </w:r>
+      <w:r>
+        <w:rPr>
+          <w:b w:val="0"/>
+        </w:rPr>
+        <w:t xml:space="preserve"> stage, and a </w:t>
+      </w:r>
+      <w:r>
+        <w:rPr>
+          <w:b/>
+        </w:rPr>
+        <w:t>routing</w:t>
+      </w:r>
+      <w:r>
+        <w:rPr>
+          <w:b w:val="0"/>
+        </w:rPr>
+        <w:t xml:space="preserve"> engine.</w:t>
       </w:r>
     </w:p>
     <w:tbl>
@@ -185,14 +216,14 @@
         <w:tblLook w:firstColumn="1" w:firstRow="1" w:lastColumn="0" w:lastRow="0" w:noHBand="0" w:noVBand="1" w:val="04A0"/>
       </w:tblPr>
       <w:tblGrid>
-        <w:gridCol w:w="3312"/>
-        <w:gridCol w:w="3312"/>
-        <w:gridCol w:w="3312"/>
+        <w:gridCol w:w="3360"/>
+        <w:gridCol w:w="3360"/>
+        <w:gridCol w:w="3360"/>
       </w:tblGrid>
       <w:tr>
         <w:tc>
           <w:tcPr>
-            <w:tcW w:type="dxa" w:w="1728"/>
+            <w:tcW w:type="dxa" w:w="2160"/>
           </w:tcPr>
           <w:p>
             <w:pPr>
@@ -201,15 +232,15 @@
             <w:r>
               <w:rPr>
                 <w:b/>
-                <w:sz w:val="17"/>
+                <w:sz w:val="16"/>
               </w:rPr>
-              <w:t>Subsystem</w:t>
+              <w:t>Subsystem / Decision</w:t>
             </w:r>
           </w:p>
         </w:tc>
         <w:tc>
           <w:tcPr>
-            <w:tcW w:type="dxa" w:w="4608"/>
+            <w:tcW w:type="dxa" w:w="4752"/>
           </w:tcPr>
           <w:p>
             <w:pPr>
@@ -218,15 +249,15 @@
             <w:r>
               <w:rPr>
                 <w:b/>
-                <w:sz w:val="17"/>
+                <w:sz w:val="16"/>
               </w:rPr>
-              <w:t>Design Decision</w:t>
+              <w:t>What it does</w:t>
             </w:r>
           </w:p>
         </w:tc>
         <w:tc>
           <w:tcPr>
-            <w:tcW w:type="dxa" w:w="3744"/>
+            <w:tcW w:type="dxa" w:w="3456"/>
           </w:tcPr>
           <w:p>
             <w:pPr>
@@ -235,9 +266,9 @@
             <w:r>
               <w:rPr>
                 <w:b/>
-                <w:sz w:val="17"/>
+                <w:sz w:val="16"/>
               </w:rPr>
-              <w:t>Constraint Satisfied</w:t>
+              <w:t>Constraint satisfied</w:t>
             </w:r>
           </w:p>
         </w:tc>
@@ -245,7 +276,7 @@
       <w:tr>
         <w:tc>
           <w:tcPr>
-            <w:tcW w:type="dxa" w:w="1728"/>
+            <w:tcW w:type="dxa" w:w="2160"/>
           </w:tcPr>
           <w:p>
             <w:pPr>
@@ -253,15 +284,15 @@
             </w:pPr>
             <w:r>
               <w:rPr>
-                <w:sz w:val="17"/>
+                <w:sz w:val="16"/>
               </w:rPr>
-              <w:t>Distance estimation</w:t>
+              <w:t>Site survey (raw RSSI)</w:t>
             </w:r>
           </w:p>
         </w:tc>
         <w:tc>
           <w:tcPr>
-            <w:tcW w:type="dxa" w:w="4608"/>
+            <w:tcW w:type="dxa" w:w="4752"/>
           </w:tcPr>
           <w:p>
             <w:pPr>
@@ -269,15 +300,15 @@
             </w:pPr>
             <w:r>
               <w:rPr>
-                <w:sz w:val="17"/>
+                <w:sz w:val="16"/>
               </w:rPr>
-              <w:t>Log-distance path loss model (d = 10^((RSSI_D0 − RSSI)/(10·N))) with calibrated RSSI_D0 = −63 dBm, N = 2.3</w:t>
+              <w:t>User stands at known grid cells; app buffers raw per-beacon RSSI (no smoothing). Multi-session safe via per-phone session_id.</w:t>
             </w:r>
           </w:p>
         </w:tc>
         <w:tc>
           <w:tcPr>
-            <w:tcW w:type="dxa" w:w="3744"/>
+            <w:tcW w:type="dxa" w:w="3456"/>
           </w:tcPr>
           <w:p>
             <w:pPr>
@@ -285,9 +316,9 @@
             </w:pPr>
             <w:r>
               <w:rPr>
-                <w:sz w:val="17"/>
+                <w:sz w:val="16"/>
               </w:rPr>
-              <w:t>Maps raw RSSI to meters; accounts for indoor multipath</w:t>
+              <w:t>Captures true sensor-noise variance; 91 cells × 13 beacons collected.</w:t>
             </w:r>
           </w:p>
         </w:tc>
@@ -295,7 +326,7 @@
       <w:tr>
         <w:tc>
           <w:tcPr>
-            <w:tcW w:type="dxa" w:w="1728"/>
+            <w:tcW w:type="dxa" w:w="2160"/>
           </w:tcPr>
           <w:p>
             <w:pPr>
@@ -303,15 +334,15 @@
             </w:pPr>
             <w:r>
               <w:rPr>
-                <w:sz w:val="17"/>
+                <w:sz w:val="16"/>
               </w:rPr>
-              <w:t>Position solving</w:t>
+              <w:t>Fingerprint matcher (kNN)</w:t>
             </w:r>
           </w:p>
         </w:tc>
         <w:tc>
           <w:tcPr>
-            <w:tcW w:type="dxa" w:w="4608"/>
+            <w:tcW w:type="dxa" w:w="4752"/>
           </w:tcPr>
           <w:p>
             <w:pPr>
@@ -319,15 +350,15 @@
             </w:pPr>
             <w:r>
               <w:rPr>
-                <w:sz w:val="17"/>
+                <w:sz w:val="16"/>
               </w:rPr>
-              <w:t>Least-squares 2D trilateration via numpy.linalg.lstsq with 3+ beacons</w:t>
+              <w:t>Euclidean nearest-neighbor in RSSI space; position = inverse-distance-weighted centroid of top-4 cells. Unheard beacons → floor RSSI (−110 dBm).</w:t>
             </w:r>
           </w:p>
         </w:tc>
         <w:tc>
           <w:tcPr>
-            <w:tcW w:type="dxa" w:w="3744"/>
+            <w:tcW w:type="dxa" w:w="3456"/>
           </w:tcPr>
           <w:p>
             <w:pPr>
@@ -335,9 +366,9 @@
             </w:pPr>
             <w:r>
               <w:rPr>
-                <w:sz w:val="17"/>
+                <w:sz w:val="16"/>
               </w:rPr>
-              <w:t>Overdetermined system improves accuracy; degrades gracefully to 3-beacon minimum</w:t>
+              <w:t>Interpolates between survey points; robust to dropped beacons. Measured RMSE 4.67 m.</w:t>
             </w:r>
           </w:p>
         </w:tc>
@@ -345,7 +376,7 @@
       <w:tr>
         <w:tc>
           <w:tcPr>
-            <w:tcW w:type="dxa" w:w="1728"/>
+            <w:tcW w:type="dxa" w:w="2160"/>
           </w:tcPr>
           <w:p>
             <w:pPr>
@@ -353,15 +384,15 @@
             </w:pPr>
             <w:r>
               <w:rPr>
-                <w:sz w:val="17"/>
+                <w:sz w:val="16"/>
               </w:rPr>
-              <w:t>Noise filtering</w:t>
+              <w:t>Measurement noise R</w:t>
             </w:r>
           </w:p>
         </w:tc>
         <w:tc>
           <w:tcPr>
-            <w:tcW w:type="dxa" w:w="4608"/>
+            <w:tcW w:type="dxa" w:w="4752"/>
           </w:tcPr>
           <w:p>
             <w:pPr>
@@ -369,15 +400,15 @@
             </w:pPr>
             <w:r>
               <w:rPr>
-                <w:sz w:val="17"/>
+                <w:sz w:val="16"/>
               </w:rPr>
-              <w:t>4D Kalman filter (state: [x, y, vx, vy]) with Innovation-based Adaptive Estimation (IAE) for measurement noise R</w:t>
+              <w:t>Estimated by leave-one-out cross-validation on the survey, not guessed.</w:t>
             </w:r>
           </w:p>
         </w:tc>
         <w:tc>
           <w:tcPr>
-            <w:tcW w:type="dxa" w:w="3744"/>
+            <w:tcW w:type="dxa" w:w="3456"/>
           </w:tcPr>
           <w:p>
             <w:pPr>
@@ -385,9 +416,9 @@
             </w:pPr>
             <w:r>
               <w:rPr>
-                <w:sz w:val="17"/>
+                <w:sz w:val="16"/>
               </w:rPr>
-              <w:t>Smooths trilateration jitter without a priori noise tuning</w:t>
+              <w:t>Seeds Kalman R with empirical std: 2.55 m (x), 3.91 m (y).</w:t>
             </w:r>
           </w:p>
         </w:tc>
@@ -395,7 +426,7 @@
       <w:tr>
         <w:tc>
           <w:tcPr>
-            <w:tcW w:type="dxa" w:w="1728"/>
+            <w:tcW w:type="dxa" w:w="2160"/>
           </w:tcPr>
           <w:p>
             <w:pPr>
@@ -403,15 +434,15 @@
             </w:pPr>
             <w:r>
               <w:rPr>
-                <w:sz w:val="17"/>
+                <w:sz w:val="16"/>
               </w:rPr>
-              <w:t>Beacon selection</w:t>
+              <w:t>4D Kalman filter</w:t>
             </w:r>
           </w:p>
         </w:tc>
         <w:tc>
           <w:tcPr>
-            <w:tcW w:type="dxa" w:w="4608"/>
+            <w:tcW w:type="dxa" w:w="4752"/>
           </w:tcPr>
           <w:p>
             <w:pPr>
@@ -419,15 +450,15 @@
             </w:pPr>
             <w:r>
               <w:rPr>
-                <w:sz w:val="17"/>
+                <w:sz w:val="16"/>
               </w:rPr>
-              <w:t>Hysteresis algorithm (10 dB swap threshold) on the client side</w:t>
+              <w:t>Constant-velocity + white-noise-acceleration model (σ_a = 0.5 m/s²); R from LOO estimate.</w:t>
             </w:r>
           </w:p>
         </w:tc>
         <w:tc>
           <w:tcPr>
-            <w:tcW w:type="dxa" w:w="3744"/>
+            <w:tcW w:type="dxa" w:w="3456"/>
           </w:tcPr>
           <w:p>
             <w:pPr>
@@ -435,9 +466,9 @@
             </w:pPr>
             <w:r>
               <w:rPr>
-                <w:sz w:val="17"/>
+                <w:sz w:val="16"/>
               </w:rPr>
-              <w:t>Prevents rapid beacon set flipping that destabilizes estimates</w:t>
+              <w:t>Smooths match jitter without manual tuning; snappiness tunable via σ_a.</w:t>
             </w:r>
           </w:p>
         </w:tc>
@@ -445,7 +476,7 @@
       <w:tr>
         <w:tc>
           <w:tcPr>
-            <w:tcW w:type="dxa" w:w="1728"/>
+            <w:tcW w:type="dxa" w:w="2160"/>
           </w:tcPr>
           <w:p>
             <w:pPr>
@@ -453,15 +484,15 @@
             </w:pPr>
             <w:r>
               <w:rPr>
-                <w:sz w:val="17"/>
+                <w:sz w:val="16"/>
               </w:rPr>
-              <w:t>Calibration</w:t>
+              <w:t>Routing + path constraint</w:t>
             </w:r>
           </w:p>
         </w:tc>
         <w:tc>
           <w:tcPr>
-            <w:tcW w:type="dxa" w:w="4608"/>
+            <w:tcW w:type="dxa" w:w="4752"/>
           </w:tcPr>
           <w:p>
             <w:pPr>
@@ -469,15 +500,15 @@
             </w:pPr>
             <w:r>
               <w:rPr>
-                <w:sz w:val="17"/>
+                <w:sz w:val="16"/>
               </w:rPr>
-              <w:t>Empirical RSSI sampling at known distances → statistical noise analysis → suggested Q/R initialization</w:t>
+              <w:t>Dijkstra over a walkable-path polyline; snaps estimate to nearest path point.</w:t>
             </w:r>
           </w:p>
         </w:tc>
         <w:tc>
           <w:tcPr>
-            <w:tcW w:type="dxa" w:w="3744"/>
+            <w:tcW w:type="dxa" w:w="3456"/>
           </w:tcPr>
           <w:p>
             <w:pPr>
@@ -485,9 +516,9 @@
             </w:pPr>
             <w:r>
               <w:rPr>
-                <w:sz w:val="17"/>
+                <w:sz w:val="16"/>
               </w:rPr>
-              <w:t>Adapts system to site-specific RF environment without manual tuning</w:t>
+              <w:t>Keeps the user on real corridors; powers 6F/8F turn-by-turn navigation.</w:t>
             </w:r>
           </w:p>
         </w:tc>
@@ -500,6 +531,7 @@
     </w:p>
     <w:p>
       <w:pPr>
+        <w:spacing w:after="80"/>
         <w:jc w:val="both"/>
       </w:pPr>
       <w:r>
@@ -512,35 +544,37 @@
         <w:rPr>
           <w:b w:val="0"/>
         </w:rPr>
-        <w:t>deploying 3–4 beacons per zone at ~$30–50 each yields a total infrastructure cost of under $200 per navigable area. The adaptive Kalman filter eliminates the need for manual re-tuning when environmental RF conditions change, reducing maintenance burden. The phone-to-backend architecture keeps computation off the resource-constrained mobile device while enabling rapid algorithm iteration on the server side.</w:t>
+        <w:t>one ~$200 beacon set plus a one-time survey yields full-floor navigation on hardware users already own. The fingerprint + LOO-estimated R pipeline removes per-deployment manual tuning, and the path constraint converts a 4.67 m raw estimate into usable corridor-level guidance — the dominant Y-axis error (3.91 m) is largely absorbed once the position is snapped to the walkable polyline.</w:t>
       </w:r>
     </w:p>
     <w:p>
       <w:pPr>
-        <w:spacing w:before="160" w:after="60"/>
+        <w:spacing w:before="140" w:after="40"/>
       </w:pPr>
       <w:r>
         <w:rPr>
           <w:b/>
           <w:color w:val="1F3B73"/>
-          <w:sz w:val="23"/>
+          <w:sz w:val="22"/>
         </w:rPr>
         <w:t>3. Project Plan</w:t>
       </w:r>
     </w:p>
     <w:p>
       <w:pPr>
+        <w:spacing w:after="80"/>
         <w:jc w:val="both"/>
       </w:pPr>
       <w:r>
         <w:rPr>
           <w:b w:val="0"/>
         </w:rPr>
-        <w:t>Our PDR established the following milestone sequence: (1) hardware procurement and BLE scanning prototype, (2) trilateration algorithm validation with static beacons, (3) Kalman filter integration and parameter tuning, (4) mobile UI completion, and (5) full system integration and demo-day testing.</w:t>
+        <w:t>Our PDR milestones were: (1) BLE scanning prototype, (2) trilateration positioning, (3) Kalman smoothing, (4) mobile UI, and (5) integrated demo. Execution diverged from this plan in one major, deliberate way.</w:t>
       </w:r>
     </w:p>
     <w:p>
       <w:pPr>
+        <w:spacing w:after="80"/>
         <w:jc w:val="both"/>
       </w:pPr>
       <w:r>
@@ -553,28 +587,30 @@
         <w:rPr>
           <w:b w:val="0"/>
         </w:rPr>
-        <w:t>Milestones 1–4 were completed on schedule. The core trilateration pipeline, Kalman filtering with adaptive R estimation, and the calibration subsystem all performed as specified. The React Native app supports both iOS and Android with platform-specific BLE handling, and the Flask backend is fully functional with 12 REST endpoints.</w:t>
+        <w:t>BLE scanning, Kalman smoothing, and the mobile client were delivered. We exceeded the original scope by adding a full site-survey workflow, a leave-one-out R-estimation pipeline, an 11-figure analysis suite (RSSI heatmaps, path-loss fit, error maps, coverage, residual ellipses), and real 6th/8th-floor turn-by-turn routing — none of which were in the PDR.</w:t>
       </w:r>
     </w:p>
     <w:p>
       <w:pPr>
+        <w:spacing w:after="80"/>
         <w:jc w:val="both"/>
       </w:pPr>
       <w:r>
         <w:rPr>
           <w:b/>
         </w:rPr>
-        <w:t xml:space="preserve">Modifications and misses: </w:t>
+        <w:t xml:space="preserve">Modified / missed objectives: </w:t>
       </w:r>
       <w:r>
         <w:rPr>
           <w:b w:val="0"/>
         </w:rPr>
-        <w:t>The original plan included a fully autonomous beacon coordinate configuration workflow; this was simplified — beacon coordinates currently require manual entry in both the backend config and the mobile app, representing a usability gap for non-technical deployers. The planned quantitative accuracy benchmarking (ground-truth position error across a grid) was partially completed; full systematic error characterization across the Boelter Hall floorplan remains an open item.</w:t>
+        <w:t>Milestone 2 (trilateration) was abandoned mid-project: our measurements showed indoor multipath made path-loss distance estimates unreliable, so we pivoted to fingerprinting. This was the right call for accuracy but cost calendar time, and it means the deleted trilateration/calibration modules represent sunk effort. The sub-3 m room-level accuracy target was not met (measured 4.67 m RMSE); full systematic error characterization exists for one floor but not yet across both deployed floors.</w:t>
       </w:r>
     </w:p>
     <w:p>
       <w:pPr>
+        <w:spacing w:after="80"/>
         <w:jc w:val="both"/>
       </w:pPr>
       <w:r>
@@ -587,12 +623,12 @@
         <w:rPr>
           <w:b w:val="0"/>
         </w:rPr>
-        <w:t>The project currently sits at the end of the engineering prototype phase. The core system is functional and demonstrates the intended capability, but it is not yet at manufacturing readiness — remaining work includes automated beacon discovery and coordinate registration, rigorous multi-environment accuracy validation, and battery impact optimization on the mobile client. A follow-on design cycle would be required before commercial deployment.</w:t>
+        <w:t>The project sits at the end of the engineering-prototype phase. The integrated survey → match → Kalman → route pipeline is functional and demonstrable, but not manufacturing-ready: remaining work includes automated beacon registration, tightening accuracy toward room level (denser survey grid and/or per-beacon variance weighting), and battery optimization on the client. A follow-on design cycle is warranted before any deployment beyond the Boelter Hall pilot.</w:t>
       </w:r>
     </w:p>
     <w:sectPr>
       <w:pgSz w:w="12240" w:h="15840"/>
-      <w:pgMar w:top="1008" w:right="1152" w:bottom="1008" w:left="1152" w:header="720" w:footer="720" w:gutter="0"/>
+      <w:pgMar w:top="864" w:right="1080" w:bottom="864" w:left="1080" w:header="720" w:footer="720" w:gutter="0"/>
       <w:cols w:space="720"/>
       <w:docGrid w:linePitch="360"/>
     </w:sectPr>
@@ -968,7 +1004,7 @@
     </w:pPr>
     <w:rPr>
       <w:rFonts w:ascii="Calibri" w:hAnsi="Calibri"/>
-      <w:sz w:val="20"/>
+      <w:sz w:val="19"/>
     </w:rPr>
   </w:style>
   <w:style w:type="paragraph" w:styleId="Header">

</xml_diff>